<commit_message>
Migra la mesa financiera a OpenAI
</commit_message>
<xml_diff>
--- a/docs/01_Guia_del_estudiante.docx
+++ b/docs/01_Guia_del_estudiante.docx
@@ -114,11 +114,6 @@
           <w:szCs w:val="20"/>
         </w:rPr>
         <w:t xml:space="preserve">.</w:t>
-      </w:r>
-    </w:p>
-    <w:p>
-      <w:r>
-        <w:br w:type="page"/>
       </w:r>
     </w:p>
     <w:p>
@@ -498,7 +493,7 @@
                 <w:sz w:val="19"/>
                 <w:szCs w:val="19"/>
               </w:rPr>
-              <w:t xml:space="preserve">Python calcula indicadores; Claude los interpreta</w:t>
+              <w:t>Python calcula indicadores; OpenAI los interpreta</w:t>
             </w:r>
           </w:p>
         </w:tc>
@@ -608,7 +603,7 @@
                 <w:sz w:val="19"/>
                 <w:szCs w:val="19"/>
               </w:rPr>
-              <w:t xml:space="preserve">Redacta una nota breve y clara</w:t>
+              <w:t>Traduce el análisis a una nota clara y didáctica</w:t>
             </w:r>
           </w:p>
         </w:tc>
@@ -1258,7 +1253,7 @@
                 <w:sz w:val="19"/>
                 <w:szCs w:val="19"/>
               </w:rPr>
-              <w:t xml:space="preserve">Clara, breve y honesta; su nombre viene del latín veritas, verdad.</w:t>
+              <w:t>Mentora cercana, paciente y didáctica; explica términos financieros con palabras cotidianas, sin infantilizar.</w:t>
             </w:r>
           </w:p>
         </w:tc>
@@ -1844,6 +1839,7 @@
     <w:p>
       <w:pPr>
         <w:pStyle w:val="Heading2"/>
+        <w:pageBreakBefore/>
       </w:pPr>
       <w:r>
         <w:t xml:space="preserve">Las fórmulas que calcula Euler (Agente 2)</w:t>
@@ -2794,7 +2790,7 @@
                 <w:sz w:val="19"/>
                 <w:szCs w:val="19"/>
               </w:rPr>
-              <w:t xml:space="preserve">ANTHROPIC_API_KEY</w:t>
+              <w:t>OPENAI_API_KEY</w:t>
             </w:r>
           </w:p>
         </w:tc>
@@ -2821,7 +2817,7 @@
                 <w:sz w:val="19"/>
                 <w:szCs w:val="19"/>
               </w:rPr>
-              <w:t xml:space="preserve">Permite usar a Claude</w:t>
+              <w:t>Permite usar OpenAI</w:t>
             </w:r>
           </w:p>
         </w:tc>
@@ -2848,7 +2844,7 @@
                 <w:sz w:val="19"/>
                 <w:szCs w:val="19"/>
               </w:rPr>
-              <w:t xml:space="preserve">La entrega la docente</w:t>
+              <w:t>OpenAI Platform, en API keys</w:t>
             </w:r>
           </w:p>
         </w:tc>
@@ -4805,7 +4801,7 @@
           <w:rFonts w:ascii="Consolas" w:cs="Consolas" w:eastAsia="Consolas" w:hAnsi="Consolas"/>
           <w:color w:val="0E6F7A"/>
         </w:rPr>
-        <w:t xml:space="preserve">ANTHROPIC_API_KEY</w:t>
+        <w:t>OPENAI_API_KEY</w:t>
       </w:r>
       <w:r>
         <w:t xml:space="preserve">, </w:t>
@@ -5230,7 +5226,7 @@
         <w:t xml:space="preserve">✅ Deberías ver: </w:t>
       </w:r>
       <w:r>
-        <w:t xml:space="preserve">que Claude Code instala dependencias, corre las pruebas (20 passed o más) y muestra las entregas 1→2 y 2→3.</w:t>
+        <w:t>que Claude Code instala dependencias, corre las pruebas (22 passed o más) y muestra las entregas 1→2 y 2→3.</w:t>
       </w:r>
     </w:p>
     <w:p>
@@ -5494,11 +5490,6 @@
           <w:szCs w:val="19"/>
         </w:rPr>
         <w:t xml:space="preserve">codex mcp add alphavantage --url "https://mcp.alphavantage.co/mcp?apikey=$ALPHAVANTAGE_API_KEY"</w:t>
-      </w:r>
-    </w:p>
-    <w:p>
-      <w:r>
-        <w:br w:type="page"/>
       </w:r>
     </w:p>
     <w:p>
@@ -5967,21 +5958,16 @@
           <w:bCs/>
           <w:color w:val="0F766E"/>
         </w:rPr>
-        <w:t xml:space="preserve">✅ Deberías ver: </w:t>
-      </w:r>
-      <w:r>
-        <w:t xml:space="preserve">VS Code en el navegador y, en la terminal de abajo, </w:t>
-      </w:r>
+        <w:t>✅ Deberías ver: VS Code en el navegador y, en la terminal de abajo, 22 passed seguido del estado de tus llaves (✅ o ⬜).</w:t>
+      </w:r>
+      <w:r/>
       <w:r>
         <w:rPr>
           <w:rFonts w:ascii="Consolas" w:cs="Consolas" w:eastAsia="Consolas" w:hAnsi="Consolas"/>
           <w:color w:val="0E6F7A"/>
         </w:rPr>
-        <w:t xml:space="preserve">20 passed</w:t>
-      </w:r>
-      <w:r>
-        <w:t xml:space="preserve"> seguido del estado de tus llaves (✅ o ⬜).</w:t>
-      </w:r>
+      </w:r>
+      <w:r/>
     </w:p>
     <w:p>
       <w:pPr>
@@ -7609,7 +7595,7 @@
                 <w:sz w:val="19"/>
                 <w:szCs w:val="19"/>
               </w:rPr>
-              <w:t xml:space="preserve">Error de la API de Claude</w:t>
+              <w:t>Error de la API de OpenAI</w:t>
             </w:r>
           </w:p>
         </w:tc>
@@ -7663,7 +7649,7 @@
                 <w:sz w:val="19"/>
                 <w:szCs w:val="19"/>
               </w:rPr>
-              <w:t xml:space="preserve">Pide a la docente que revise la llave del grupo</w:t>
+              <w:t>Revisa que OPENAI_API_KEY sea válida y tenga saldo</w:t>
             </w:r>
           </w:p>
         </w:tc>
@@ -7861,14 +7847,14 @@
         <w:spacing w:after="60"/>
       </w:pPr>
       <w:r>
-        <w:t xml:space="preserve">Claude Platform Docs, MCP connector: </w:t>
+        <w:t xml:space="preserve">OpenAI Docs, MCP servers: </w:t>
       </w:r>
       <w:hyperlink w:history="1" r:id="rIdiiesmxdvuj57zsflxzji-">
         <w:r>
           <w:rPr>
             <w:rStyle w:val="Hyperlink"/>
           </w:rPr>
-          <w:t xml:space="preserve">https://platform.claude.com/docs/en/agents-and-tools/mcp-connector</w:t>
+          <w:t xml:space="preserve">https://developers.openai.com/api/docs/guides/tools-connectors-mcp</w:t>
         </w:r>
       </w:hyperlink>
     </w:p>
@@ -8087,11 +8073,12 @@
         <w:spacing w:after="120"/>
       </w:pPr>
       <w:r>
-        <w:t xml:space="preserve">Fechas de consulta: 13 de octubre de 2026. Las plataformas cambian con frecuencia; verifica antes de cada generación del diplomado.</w:t>
+        <w:t>Fechas de consulta: 22 de octubre de 2026. Las plataformas cambian con frecuencia; verifica antes de cada generación del diplomado.</w:t>
       </w:r>
     </w:p>
     <w:sectPr>
       <w:footerReference w:type="default" r:id="rId7"/>
+      <w:headerReference w:type="default" r:id="rId8"/>
       <w:pgSz w:w="12240" w:h="15840" w:orient="portrait"/>
       <w:pgMar w:top="1440" w:right="1440" w:bottom="1300" w:left="1440" w:header="708" w:footer="708" w:gutter="0"/>
       <w:pgNumType/>
@@ -8206,6 +8193,16 @@
     </w:p>
   </w:footnote>
 </w:footnotes>
+</file>
+
+<file path=word/header1.xml><?xml version="1.0" encoding="utf-8"?>
+<w:hdr xmlns:m="http://schemas.openxmlformats.org/officeDocument/2006/math" xmlns:mc="http://schemas.openxmlformats.org/markup-compatibility/2006" xmlns:mo="http://schemas.microsoft.com/office/mac/office/2008/main" xmlns:mv="urn:schemas-microsoft-com:mac:vml" xmlns:o="urn:schemas-microsoft-com:office:office" xmlns:r="http://schemas.openxmlformats.org/officeDocument/2006/relationships" xmlns:v="urn:schemas-microsoft-com:vml" xmlns:w10="urn:schemas-microsoft-com:office:word" xmlns:w14="http://schemas.microsoft.com/office/word/2010/wordml" xmlns:w="http://schemas.openxmlformats.org/wordprocessingml/2006/main" xmlns:wne="http://schemas.microsoft.com/office/word/2006/wordml" xmlns:wp14="http://schemas.microsoft.com/office/word/2010/wordprocessingDrawing" xmlns:wp="http://schemas.openxmlformats.org/drawingml/2006/wordprocessingDrawing" xmlns:wpc="http://schemas.microsoft.com/office/word/2010/wordprocessingCanvas" xmlns:wpg="http://schemas.microsoft.com/office/word/2010/wordprocessingGroup" xmlns:wpi="http://schemas.microsoft.com/office/word/2010/wordprocessingInk" xmlns:wps="http://schemas.microsoft.com/office/word/2010/wordprocessingShape" mc:Ignorable="w14 wp14">
+  <w:p>
+    <w:pPr>
+      <w:pStyle w:val="Header"/>
+    </w:pPr>
+  </w:p>
+</w:hdr>
 </file>
 
 <file path=word/numbering.xml><?xml version="1.0" encoding="utf-8"?>

</xml_diff>

<commit_message>
Define la personalidad completa de Vera
</commit_message>
<xml_diff>
--- a/docs/01_Guia_del_estudiante.docx
+++ b/docs/01_Guia_del_estudiante.docx
@@ -603,7 +603,7 @@
                 <w:sz w:val="19"/>
                 <w:szCs w:val="19"/>
               </w:rPr>
-              <w:t>Traduce el análisis a una nota clara y didáctica</w:t>
+              <w:t>Vera es clara, breve y honesta; paciente y entusiasta al explicar</w:t>
             </w:r>
           </w:p>
         </w:tc>
@@ -1253,7 +1253,7 @@
                 <w:sz w:val="19"/>
                 <w:szCs w:val="19"/>
               </w:rPr>
-              <w:t>Mentora cercana, paciente y didáctica; explica términos financieros con palabras cotidianas, sin infantilizar.</w:t>
+              <w:t>Clara, breve y honesta; paciente y entusiasta. Explica términos financieros con palabras cotidianas, sin infantilizar ni exagerar resultados.</w:t>
             </w:r>
           </w:p>
         </w:tc>

</xml_diff>